<commit_message>
EHIS-6066 Address format in template water supply
</commit_message>
<xml_diff>
--- a/PHOCS-Docgentemplates/PHOCSConstructionPermitTemplate.docx
+++ b/PHOCS-Docgentemplates/PHOCSConstructionPermitTemplate.docx
@@ -345,6 +345,14 @@
                 <w:sz w:val="24"/>
                 <w:szCs w:val="24"/>
               </w:rPr>
+              <w:t>,</w:t>
+            </w:r>
+            <w:r>
+              <w:rPr>
+                <w:rFonts w:ascii="BC Sans" w:hAnsi="BC Sans"/>
+                <w:sz w:val="24"/>
+                <w:szCs w:val="24"/>
+              </w:rPr>
               <w:t xml:space="preserve"> </w:t>
             </w:r>
             <w:r>
@@ -355,6 +363,7 @@
               </w:rPr>
               <w:t>{{</w:t>
             </w:r>
+            <w:proofErr w:type="spellStart"/>
             <w:r>
               <w:rPr>
                 <w:rFonts w:ascii="BC Sans" w:hAnsi="BC Sans"/>
@@ -363,39 +372,40 @@
               </w:rPr>
               <w:t>BLAccountPhysicalAddressState</w:t>
             </w:r>
-            <w:r>
-              <w:rPr>
-                <w:rFonts w:ascii="BC Sans" w:hAnsi="BC Sans"/>
-                <w:sz w:val="24"/>
-                <w:szCs w:val="24"/>
-              </w:rPr>
-              <w:t>}</w:t>
-            </w:r>
-            <w:proofErr w:type="gramStart"/>
-            <w:r>
-              <w:rPr>
-                <w:rFonts w:ascii="BC Sans" w:hAnsi="BC Sans"/>
-                <w:sz w:val="24"/>
-                <w:szCs w:val="24"/>
-              </w:rPr>
-              <w:t>}</w:t>
-            </w:r>
-            <w:r>
-              <w:rPr>
-                <w:rFonts w:ascii="BC Sans" w:hAnsi="BC Sans"/>
-                <w:sz w:val="24"/>
-                <w:szCs w:val="24"/>
-              </w:rPr>
-              <w:t>,{</w:t>
-            </w:r>
-            <w:proofErr w:type="gramEnd"/>
-            <w:r>
-              <w:rPr>
-                <w:rFonts w:ascii="BC Sans" w:hAnsi="BC Sans"/>
-                <w:sz w:val="24"/>
-                <w:szCs w:val="24"/>
-              </w:rPr>
-              <w:t>{BLAccountPhysicalAddressPostalCode</w:t>
+            <w:proofErr w:type="spellEnd"/>
+            <w:r>
+              <w:rPr>
+                <w:rFonts w:ascii="BC Sans" w:hAnsi="BC Sans"/>
+                <w:sz w:val="24"/>
+                <w:szCs w:val="24"/>
+              </w:rPr>
+              <w:t>}}</w:t>
+            </w:r>
+            <w:r>
+              <w:rPr>
+                <w:rFonts w:ascii="BC Sans" w:hAnsi="BC Sans"/>
+                <w:sz w:val="24"/>
+                <w:szCs w:val="24"/>
+              </w:rPr>
+              <w:t>,</w:t>
+            </w:r>
+          </w:p>
+          <w:p>
+            <w:pPr>
+              <w:spacing w:after="0"/>
+              <w:rPr>
+                <w:rFonts w:ascii="BC Sans" w:hAnsi="BC Sans"/>
+                <w:sz w:val="24"/>
+                <w:szCs w:val="24"/>
+              </w:rPr>
+            </w:pPr>
+            <w:r>
+              <w:rPr>
+                <w:rFonts w:ascii="BC Sans" w:hAnsi="BC Sans"/>
+                <w:sz w:val="24"/>
+                <w:szCs w:val="24"/>
+              </w:rPr>
+              <w:t>{{BLAccountPhysicalAddressPostalCode</w:t>
             </w:r>
             <w:proofErr w:type="gramStart"/>
             <w:r>
@@ -9362,6 +9372,14 @@
 </file>
 
 <file path=customXml/item1.xml><?xml version="1.0" encoding="utf-8"?>
+<p:properties xmlns:p="http://schemas.microsoft.com/office/2006/metadata/properties" xmlns:xsi="http://www.w3.org/2001/XMLSchema-instance" xmlns:pc="http://schemas.microsoft.com/office/infopath/2007/PartnerControls">
+  <documentManagement>
+    <_activity xmlns="13224391-9520-4043-8144-ea4246789642" xsi:nil="true"/>
+  </documentManagement>
+</p:properties>
+</file>
+
+<file path=customXml/item2.xml><?xml version="1.0" encoding="utf-8"?>
 <ct:contentTypeSchema xmlns:ct="http://schemas.microsoft.com/office/2006/metadata/contentType" xmlns:ma="http://schemas.microsoft.com/office/2006/metadata/properties/metaAttributes" ct:_="" ma:_="" ma:contentTypeName="Document" ma:contentTypeID="0x01010002381797402D29459302B87BC08D6BFF" ma:contentTypeVersion="14" ma:contentTypeDescription="Create a new document." ma:contentTypeScope="" ma:versionID="d0190f6de51f6e99d4003aca1d9fda60">
   <xsd:schema xmlns:xsd="http://www.w3.org/2001/XMLSchema" xmlns:xs="http://www.w3.org/2001/XMLSchema" xmlns:p="http://schemas.microsoft.com/office/2006/metadata/properties" xmlns:ns3="13224391-9520-4043-8144-ea4246789642" xmlns:ns4="be94fa87-42a6-40f5-955d-92ea8844be4c" targetNamespace="http://schemas.microsoft.com/office/2006/metadata/properties" ma:root="true" ma:fieldsID="d16e9fa0f80c802ed69b371a291e984e" ns3:_="" ns4:_="">
     <xsd:import namespace="13224391-9520-4043-8144-ea4246789642"/>
@@ -9588,14 +9606,6 @@
 </ct:contentTypeSchema>
 </file>
 
-<file path=customXml/item2.xml><?xml version="1.0" encoding="utf-8"?>
-<p:properties xmlns:p="http://schemas.microsoft.com/office/2006/metadata/properties" xmlns:xsi="http://www.w3.org/2001/XMLSchema-instance" xmlns:pc="http://schemas.microsoft.com/office/infopath/2007/PartnerControls">
-  <documentManagement>
-    <_activity xmlns="13224391-9520-4043-8144-ea4246789642" xsi:nil="true"/>
-  </documentManagement>
-</p:properties>
-</file>
-
 <file path=customXml/item3.xml><?xml version="1.0" encoding="utf-8"?>
 <?mso-contentType ?>
 <FormTemplates xmlns="http://schemas.microsoft.com/sharepoint/v3/contenttype/forms">
@@ -9606,6 +9616,16 @@
 </file>
 
 <file path=customXml/itemProps1.xml><?xml version="1.0" encoding="utf-8"?>
+<ds:datastoreItem xmlns:ds="http://schemas.openxmlformats.org/officeDocument/2006/customXml" ds:itemID="{DF54842B-B632-4470-BC7C-362633B9A6DF}">
+  <ds:schemaRefs>
+    <ds:schemaRef ds:uri="http://schemas.microsoft.com/office/2006/metadata/properties"/>
+    <ds:schemaRef ds:uri="http://schemas.microsoft.com/office/infopath/2007/PartnerControls"/>
+    <ds:schemaRef ds:uri="13224391-9520-4043-8144-ea4246789642"/>
+  </ds:schemaRefs>
+</ds:datastoreItem>
+</file>
+
+<file path=customXml/itemProps2.xml><?xml version="1.0" encoding="utf-8"?>
 <ds:datastoreItem xmlns:ds="http://schemas.openxmlformats.org/officeDocument/2006/customXml" ds:itemID="{FE79DDA2-865B-486C-8B68-5C0139048C07}">
   <ds:schemaRefs>
     <ds:schemaRef ds:uri="http://schemas.microsoft.com/office/2006/metadata/contentType"/>
@@ -9624,16 +9644,6 @@
 </ds:datastoreItem>
 </file>
 
-<file path=customXml/itemProps2.xml><?xml version="1.0" encoding="utf-8"?>
-<ds:datastoreItem xmlns:ds="http://schemas.openxmlformats.org/officeDocument/2006/customXml" ds:itemID="{DF54842B-B632-4470-BC7C-362633B9A6DF}">
-  <ds:schemaRefs>
-    <ds:schemaRef ds:uri="http://schemas.microsoft.com/office/2006/metadata/properties"/>
-    <ds:schemaRef ds:uri="http://schemas.microsoft.com/office/infopath/2007/PartnerControls"/>
-    <ds:schemaRef ds:uri="13224391-9520-4043-8144-ea4246789642"/>
-  </ds:schemaRefs>
-</ds:datastoreItem>
-</file>
-
 <file path=customXml/itemProps3.xml><?xml version="1.0" encoding="utf-8"?>
 <ds:datastoreItem xmlns:ds="http://schemas.openxmlformats.org/officeDocument/2006/customXml" ds:itemID="{1C5B2013-E90D-4927-A589-8E229EE0056F}">
   <ds:schemaRefs>

</xml_diff>